<commit_message>
Fix signature bugs, terbilang logic, SK placeholders, and update README
</commit_message>
<xml_diff>
--- a/templates/Contoh Cuti PNSHakim.docx
+++ b/templates/Contoh Cuti PNSHakim.docx
@@ -7,23 +7,13 @@
         <w:spacing w:after="0"/>
         <w:ind w:left="5245"/>
       </w:pPr>
-      <w:proofErr w:type="spellStart"/>
       <w:r>
         <w:rPr>
           <w:rFonts w:ascii="Book Antiqua" w:hAnsi="Book Antiqua" w:cs="Arial"/>
           <w:sz w:val="18"/>
           <w:szCs w:val="18"/>
         </w:rPr>
-        <w:t>Samarinda</w:t>
-      </w:r>
-      <w:proofErr w:type="spellEnd"/>
-      <w:r>
-        <w:rPr>
-          <w:rFonts w:ascii="Book Antiqua" w:hAnsi="Book Antiqua" w:cs="Arial"/>
-          <w:sz w:val="18"/>
-          <w:szCs w:val="18"/>
-        </w:rPr>
-        <w:t xml:space="preserve">, </w:t>
+        <w:t xml:space="preserve">Samarinda, </w:t>
       </w:r>
       <w:r>
         <w:rPr>
@@ -31,25 +21,7 @@
           <w:sz w:val="18"/>
           <w:szCs w:val="18"/>
         </w:rPr>
-        <w:t>${</w:t>
-      </w:r>
-      <w:proofErr w:type="spellStart"/>
-      <w:r>
-        <w:rPr>
-          <w:rFonts w:ascii="Book Antiqua" w:hAnsi="Book Antiqua" w:cs="Arial"/>
-          <w:sz w:val="18"/>
-          <w:szCs w:val="18"/>
-        </w:rPr>
-        <w:t>tgl_surat</w:t>
-      </w:r>
-      <w:proofErr w:type="spellEnd"/>
-      <w:r>
-        <w:rPr>
-          <w:rFonts w:ascii="Book Antiqua" w:hAnsi="Book Antiqua" w:cs="Arial"/>
-          <w:sz w:val="18"/>
-          <w:szCs w:val="18"/>
-        </w:rPr>
-        <w:t>}</w:t>
+        <w:t>${tgl_surat}</w:t>
       </w:r>
     </w:p>
     <w:p>
@@ -72,42 +44,15 @@
           <w:szCs w:val="18"/>
         </w:rPr>
         <w:tab/>
+        <w:t>Kepada</w:t>
       </w:r>
-      <w:proofErr w:type="spellStart"/>
       <w:r>
         <w:rPr>
           <w:rFonts w:ascii="Book Antiqua" w:hAnsi="Book Antiqua" w:cs="Arial"/>
           <w:sz w:val="18"/>
           <w:szCs w:val="18"/>
         </w:rPr>
-        <w:t>Kepada</w:t>
-      </w:r>
-      <w:proofErr w:type="spellEnd"/>
-      <w:r>
-        <w:rPr>
-          <w:rFonts w:ascii="Book Antiqua" w:hAnsi="Book Antiqua" w:cs="Arial"/>
-          <w:sz w:val="18"/>
-          <w:szCs w:val="18"/>
-        </w:rPr>
-        <w:t xml:space="preserve"> </w:t>
-      </w:r>
-      <w:proofErr w:type="spellStart"/>
-      <w:r>
-        <w:rPr>
-          <w:rFonts w:ascii="Book Antiqua" w:hAnsi="Book Antiqua" w:cs="Arial"/>
-          <w:sz w:val="18"/>
-          <w:szCs w:val="18"/>
-        </w:rPr>
-        <w:t>Yth</w:t>
-      </w:r>
-      <w:proofErr w:type="spellEnd"/>
-      <w:r>
-        <w:rPr>
-          <w:rFonts w:ascii="Book Antiqua" w:hAnsi="Book Antiqua" w:cs="Arial"/>
-          <w:sz w:val="18"/>
-          <w:szCs w:val="18"/>
-        </w:rPr>
-        <w:t>,</w:t>
+        <w:t xml:space="preserve"> Yth,</w:t>
       </w:r>
     </w:p>
     <w:p>
@@ -131,7 +76,6 @@
         </w:rPr>
         <w:tab/>
       </w:r>
-      <w:proofErr w:type="spellStart"/>
       <w:r>
         <w:rPr>
           <w:rFonts w:ascii="Book Antiqua" w:hAnsi="Book Antiqua" w:cs="Arial"/>
@@ -140,32 +84,13 @@
         </w:rPr>
         <w:t>Ketua</w:t>
       </w:r>
-      <w:proofErr w:type="spellEnd"/>
       <w:r>
         <w:rPr>
           <w:rFonts w:ascii="Book Antiqua" w:hAnsi="Book Antiqua" w:cs="Arial"/>
           <w:sz w:val="18"/>
           <w:szCs w:val="18"/>
         </w:rPr>
-        <w:t xml:space="preserve"> </w:t>
-      </w:r>
-      <w:proofErr w:type="spellStart"/>
-      <w:r>
-        <w:rPr>
-          <w:rFonts w:ascii="Book Antiqua" w:hAnsi="Book Antiqua" w:cs="Arial"/>
-          <w:sz w:val="18"/>
-          <w:szCs w:val="18"/>
-        </w:rPr>
-        <w:t>Pengadilan</w:t>
-      </w:r>
-      <w:proofErr w:type="spellEnd"/>
-      <w:r>
-        <w:rPr>
-          <w:rFonts w:ascii="Book Antiqua" w:hAnsi="Book Antiqua" w:cs="Arial"/>
-          <w:sz w:val="18"/>
-          <w:szCs w:val="18"/>
-        </w:rPr>
-        <w:t xml:space="preserve"> T</w:t>
+        <w:t xml:space="preserve"> Pengadilan T</w:t>
       </w:r>
       <w:r>
         <w:rPr>
@@ -173,18 +98,8 @@
           <w:sz w:val="18"/>
           <w:szCs w:val="18"/>
         </w:rPr>
-        <w:t xml:space="preserve">ata Usaha Negara </w:t>
+        <w:t>ata Usaha Negara Samarinda</w:t>
       </w:r>
-      <w:proofErr w:type="spellStart"/>
-      <w:r>
-        <w:rPr>
-          <w:rFonts w:ascii="Book Antiqua" w:hAnsi="Book Antiqua" w:cs="Arial"/>
-          <w:sz w:val="18"/>
-          <w:szCs w:val="18"/>
-        </w:rPr>
-        <w:t>Samarinda</w:t>
-      </w:r>
-      <w:proofErr w:type="spellEnd"/>
     </w:p>
     <w:p>
       <w:pPr>
@@ -236,7 +151,6 @@
         </w:rPr>
         <w:tab/>
       </w:r>
-      <w:proofErr w:type="spellStart"/>
       <w:r>
         <w:rPr>
           <w:rFonts w:ascii="Book Antiqua" w:hAnsi="Book Antiqua" w:cs="Arial"/>
@@ -245,7 +159,6 @@
         </w:rPr>
         <w:t>Samarinda</w:t>
       </w:r>
-      <w:proofErr w:type="spellEnd"/>
     </w:p>
     <w:p>
       <w:pPr>
@@ -335,8 +248,6 @@
           <w:szCs w:val="18"/>
         </w:rPr>
       </w:pPr>
-      <w:proofErr w:type="spellStart"/>
-      <w:proofErr w:type="gramStart"/>
       <w:r>
         <w:rPr>
           <w:rFonts w:ascii="Book Antiqua" w:hAnsi="Book Antiqua"/>
@@ -344,9 +255,8 @@
           <w:sz w:val="18"/>
           <w:szCs w:val="18"/>
         </w:rPr>
-        <w:t>Nomor</w:t>
+        <w:t xml:space="preserve">Nomor : </w:t>
       </w:r>
-      <w:proofErr w:type="spellEnd"/>
       <w:r>
         <w:rPr>
           <w:rFonts w:ascii="Book Antiqua" w:hAnsi="Book Antiqua"/>
@@ -354,17 +264,7 @@
           <w:sz w:val="18"/>
           <w:szCs w:val="18"/>
         </w:rPr>
-        <w:t xml:space="preserve"> :</w:t>
-      </w:r>
-      <w:proofErr w:type="gramEnd"/>
-      <w:r>
-        <w:rPr>
-          <w:rFonts w:ascii="Book Antiqua" w:hAnsi="Book Antiqua"/>
-          <w:b/>
-          <w:sz w:val="18"/>
-          <w:szCs w:val="18"/>
-        </w:rPr>
-        <w:t xml:space="preserve"> </w:t>
+        <w:t>$</w:t>
       </w:r>
       <w:r>
         <w:rPr>
@@ -373,17 +273,7 @@
           <w:sz w:val="18"/>
           <w:szCs w:val="18"/>
         </w:rPr>
-        <w:t xml:space="preserve">         /</w:t>
-      </w:r>
-      <w:proofErr w:type="gramStart"/>
-      <w:r>
-        <w:rPr>
-          <w:rFonts w:ascii="Book Antiqua" w:hAnsi="Book Antiqua" w:cs="Arial"/>
-          <w:b/>
-          <w:sz w:val="18"/>
-          <w:szCs w:val="18"/>
-        </w:rPr>
-        <w:t>SEK.</w:t>
+        <w:t>{n}</w:t>
       </w:r>
       <w:r>
         <w:rPr>
@@ -392,17 +282,7 @@
           <w:sz w:val="18"/>
           <w:szCs w:val="18"/>
         </w:rPr>
-        <w:t>PTUN.W</w:t>
-      </w:r>
-      <w:proofErr w:type="gramEnd"/>
-      <w:r>
-        <w:rPr>
-          <w:rFonts w:ascii="Book Antiqua" w:hAnsi="Book Antiqua" w:cs="Arial"/>
-          <w:b/>
-          <w:sz w:val="18"/>
-          <w:szCs w:val="18"/>
-        </w:rPr>
-        <w:t>6-TUN3/KP5.3/</w:t>
+        <w:t xml:space="preserve"> /</w:t>
       </w:r>
       <w:r>
         <w:rPr>
@@ -411,7 +291,7 @@
           <w:sz w:val="18"/>
           <w:szCs w:val="18"/>
         </w:rPr>
-        <w:t>I/202</w:t>
+        <w:t>K</w:t>
       </w:r>
       <w:r>
         <w:rPr>
@@ -420,7 +300,61 @@
           <w:sz w:val="18"/>
           <w:szCs w:val="18"/>
         </w:rPr>
-        <w:t>6</w:t>
+        <w:t>PTUN.W6-TUN3/KP5.3/</w:t>
+      </w:r>
+      <w:r>
+        <w:rPr>
+          <w:rFonts w:ascii="Book Antiqua" w:hAnsi="Book Antiqua" w:cs="Arial"/>
+          <w:b/>
+          <w:sz w:val="18"/>
+          <w:szCs w:val="18"/>
+        </w:rPr>
+        <w:t>$</w:t>
+      </w:r>
+      <w:r>
+        <w:rPr>
+          <w:rFonts w:ascii="Book Antiqua" w:hAnsi="Book Antiqua" w:cs="Arial"/>
+          <w:b/>
+          <w:sz w:val="18"/>
+          <w:szCs w:val="18"/>
+        </w:rPr>
+        <w:t>{</w:t>
+      </w:r>
+      <w:r>
+        <w:rPr>
+          <w:rFonts w:ascii="Book Antiqua" w:hAnsi="Book Antiqua" w:cs="Arial"/>
+          <w:b/>
+          <w:sz w:val="18"/>
+          <w:szCs w:val="18"/>
+        </w:rPr>
+        <w:t>BULAN_ROMAWI}</w:t>
+      </w:r>
+      <w:r>
+        <w:rPr>
+          <w:rFonts w:ascii="Book Antiqua" w:hAnsi="Book Antiqua" w:cs="Arial"/>
+          <w:b/>
+          <w:sz w:val="18"/>
+          <w:szCs w:val="18"/>
+        </w:rPr>
+        <w:t>/</w:t>
+      </w:r>
+      <w:r>
+        <w:rPr>
+          <w:rFonts w:ascii="Book Antiqua" w:hAnsi="Book Antiqua" w:cs="Arial"/>
+          <w:b/>
+          <w:sz w:val="18"/>
+          <w:szCs w:val="18"/>
+        </w:rPr>
+        <w:t>$</w:t>
+      </w:r>
+      <w:r>
+        <w:rPr>
+          <w:rFonts w:ascii="Book Antiqua" w:hAnsi="Book Antiqua" w:cs="Arial"/>
+          <w:b/>
+          <w:sz w:val="18"/>
+          <w:szCs w:val="18"/>
+        </w:rPr>
+        <w:t>{TAHUN}</w:t>
       </w:r>
     </w:p>
     <w:tbl>
@@ -580,7 +514,6 @@
                 <w:szCs w:val="18"/>
               </w:rPr>
             </w:pPr>
-            <w:proofErr w:type="spellStart"/>
             <w:r>
               <w:rPr>
                 <w:rFonts w:ascii="Book Antiqua" w:hAnsi="Book Antiqua"/>
@@ -589,7 +522,6 @@
               </w:rPr>
               <w:t>Jabatan</w:t>
             </w:r>
-            <w:proofErr w:type="spellEnd"/>
           </w:p>
         </w:tc>
         <w:tc>
@@ -610,25 +542,7 @@
                 <w:sz w:val="18"/>
                 <w:szCs w:val="18"/>
               </w:rPr>
-              <w:t>${</w:t>
-            </w:r>
-            <w:proofErr w:type="spellStart"/>
-            <w:r>
-              <w:rPr>
-                <w:rFonts w:ascii="Book Antiqua" w:hAnsi="Book Antiqua"/>
-                <w:sz w:val="18"/>
-                <w:szCs w:val="18"/>
-              </w:rPr>
-              <w:t>jabatan</w:t>
-            </w:r>
-            <w:proofErr w:type="spellEnd"/>
-            <w:r>
-              <w:rPr>
-                <w:rFonts w:ascii="Book Antiqua" w:hAnsi="Book Antiqua"/>
-                <w:sz w:val="18"/>
-                <w:szCs w:val="18"/>
-              </w:rPr>
-              <w:t>}</w:t>
+              <w:t>${jabatan}</w:t>
             </w:r>
           </w:p>
         </w:tc>
@@ -672,25 +586,7 @@
                 <w:sz w:val="18"/>
                 <w:szCs w:val="18"/>
               </w:rPr>
-              <w:t>${</w:t>
-            </w:r>
-            <w:proofErr w:type="spellStart"/>
-            <w:r>
-              <w:rPr>
-                <w:rFonts w:ascii="Book Antiqua" w:hAnsi="Book Antiqua"/>
-                <w:sz w:val="18"/>
-                <w:szCs w:val="18"/>
-              </w:rPr>
-              <w:t>golongan</w:t>
-            </w:r>
-            <w:proofErr w:type="spellEnd"/>
-            <w:r>
-              <w:rPr>
-                <w:rFonts w:ascii="Book Antiqua" w:hAnsi="Book Antiqua"/>
-                <w:sz w:val="18"/>
-                <w:szCs w:val="18"/>
-              </w:rPr>
-              <w:t>}</w:t>
+              <w:t>${golongan}</w:t>
             </w:r>
           </w:p>
         </w:tc>
@@ -714,18 +610,8 @@
                 <w:sz w:val="18"/>
                 <w:szCs w:val="18"/>
               </w:rPr>
-              <w:t xml:space="preserve">Unit </w:t>
-            </w:r>
-            <w:proofErr w:type="spellStart"/>
-            <w:r>
-              <w:rPr>
-                <w:rFonts w:ascii="Book Antiqua" w:hAnsi="Book Antiqua"/>
-                <w:sz w:val="18"/>
-                <w:szCs w:val="18"/>
-              </w:rPr>
-              <w:t>Kerja</w:t>
-            </w:r>
-            <w:proofErr w:type="spellEnd"/>
+              <w:t>Unit Kerja</w:t>
+            </w:r>
           </w:p>
         </w:tc>
         <w:tc>
@@ -746,18 +632,8 @@
                 <w:sz w:val="18"/>
                 <w:szCs w:val="18"/>
               </w:rPr>
-              <w:t xml:space="preserve">PTUN </w:t>
-            </w:r>
-            <w:proofErr w:type="spellStart"/>
-            <w:r>
-              <w:rPr>
-                <w:rFonts w:ascii="Book Antiqua" w:hAnsi="Book Antiqua"/>
-                <w:sz w:val="18"/>
-                <w:szCs w:val="18"/>
-              </w:rPr>
-              <w:t>Samarinda</w:t>
-            </w:r>
-            <w:proofErr w:type="spellEnd"/>
+              <w:t>PTUN Samarinda</w:t>
+            </w:r>
           </w:p>
         </w:tc>
         <w:tc>
@@ -778,18 +654,8 @@
                 <w:sz w:val="18"/>
                 <w:szCs w:val="18"/>
               </w:rPr>
-              <w:t xml:space="preserve">Masa </w:t>
-            </w:r>
-            <w:proofErr w:type="spellStart"/>
-            <w:r>
-              <w:rPr>
-                <w:rFonts w:ascii="Book Antiqua" w:hAnsi="Book Antiqua"/>
-                <w:sz w:val="18"/>
-                <w:szCs w:val="18"/>
-              </w:rPr>
-              <w:t>Kerja</w:t>
-            </w:r>
-            <w:proofErr w:type="spellEnd"/>
+              <w:t>Masa Kerja</w:t>
+            </w:r>
           </w:p>
         </w:tc>
         <w:tc>
@@ -810,25 +676,7 @@
                 <w:sz w:val="18"/>
                 <w:szCs w:val="18"/>
               </w:rPr>
-              <w:t>${</w:t>
-            </w:r>
-            <w:proofErr w:type="spellStart"/>
-            <w:r>
-              <w:rPr>
-                <w:rFonts w:ascii="Book Antiqua" w:hAnsi="Book Antiqua"/>
-                <w:sz w:val="18"/>
-                <w:szCs w:val="18"/>
-              </w:rPr>
-              <w:t>masa_kerja</w:t>
-            </w:r>
-            <w:proofErr w:type="spellEnd"/>
-            <w:r>
-              <w:rPr>
-                <w:rFonts w:ascii="Book Antiqua" w:hAnsi="Book Antiqua"/>
-                <w:sz w:val="18"/>
-                <w:szCs w:val="18"/>
-              </w:rPr>
-              <w:t>}</w:t>
+              <w:t>${masa_kerja}</w:t>
             </w:r>
           </w:p>
         </w:tc>
@@ -916,16 +764,7 @@
                 <w:sz w:val="18"/>
                 <w:szCs w:val="18"/>
               </w:rPr>
-              <w:t xml:space="preserve">Cuti </w:t>
-            </w:r>
-            <w:proofErr w:type="spellStart"/>
-            <w:r>
-              <w:rPr>
-                <w:rFonts w:ascii="Book Antiqua" w:hAnsi="Book Antiqua"/>
-                <w:sz w:val="18"/>
-                <w:szCs w:val="18"/>
-              </w:rPr>
-              <w:t>Tahun</w:t>
+              <w:t>Cuti Tahun</w:t>
             </w:r>
             <w:r>
               <w:rPr>
@@ -935,7 +774,6 @@
               </w:rPr>
               <w:t>an</w:t>
             </w:r>
-            <w:proofErr w:type="spellEnd"/>
           </w:p>
         </w:tc>
         <w:tc>
@@ -1137,19 +975,8 @@
                 <w:sz w:val="18"/>
                 <w:szCs w:val="18"/>
               </w:rPr>
-              <w:t xml:space="preserve">Cuti </w:t>
-            </w:r>
-            <w:proofErr w:type="spellStart"/>
-            <w:r>
-              <w:rPr>
-                <w:rFonts w:ascii="Book Antiqua" w:hAnsi="Book Antiqua"/>
-                <w:bCs/>
-                <w:sz w:val="18"/>
-                <w:szCs w:val="18"/>
-              </w:rPr>
-              <w:t>Melahirkan</w:t>
-            </w:r>
-            <w:proofErr w:type="spellEnd"/>
+              <w:t>Cuti Melahirkan</w:t>
+            </w:r>
           </w:p>
         </w:tc>
         <w:tc>
@@ -1233,18 +1060,8 @@
                 <w:sz w:val="18"/>
                 <w:szCs w:val="18"/>
               </w:rPr>
-              <w:t xml:space="preserve">Karena Alasan </w:t>
-            </w:r>
-            <w:proofErr w:type="spellStart"/>
-            <w:r>
-              <w:rPr>
-                <w:rFonts w:ascii="Book Antiqua" w:hAnsi="Book Antiqua"/>
-                <w:sz w:val="18"/>
-                <w:szCs w:val="18"/>
-              </w:rPr>
-              <w:t>Penting</w:t>
-            </w:r>
-            <w:proofErr w:type="spellEnd"/>
+              <w:t>Karena Alasan Penting</w:t>
+            </w:r>
           </w:p>
         </w:tc>
         <w:tc>
@@ -1298,25 +1115,7 @@
                 <w:sz w:val="18"/>
                 <w:szCs w:val="18"/>
               </w:rPr>
-              <w:t xml:space="preserve">Cuti di Luar </w:t>
-            </w:r>
-            <w:proofErr w:type="spellStart"/>
-            <w:r>
-              <w:rPr>
-                <w:rFonts w:ascii="Book Antiqua" w:hAnsi="Book Antiqua"/>
-                <w:sz w:val="18"/>
-                <w:szCs w:val="18"/>
-              </w:rPr>
-              <w:t>Tanggungan</w:t>
-            </w:r>
-            <w:proofErr w:type="spellEnd"/>
-            <w:r>
-              <w:rPr>
-                <w:rFonts w:ascii="Book Antiqua" w:hAnsi="Book Antiqua"/>
-                <w:sz w:val="18"/>
-                <w:szCs w:val="18"/>
-              </w:rPr>
-              <w:t xml:space="preserve"> Negara</w:t>
+              <w:t>Cuti di Luar Tanggungan Negara</w:t>
             </w:r>
           </w:p>
         </w:tc>
@@ -1418,25 +1217,7 @@
                 <w:sz w:val="18"/>
                 <w:szCs w:val="18"/>
               </w:rPr>
-              <w:t>${</w:t>
-            </w:r>
-            <w:proofErr w:type="spellStart"/>
-            <w:r>
-              <w:rPr>
-                <w:rFonts w:ascii="Book Antiqua" w:hAnsi="Book Antiqua"/>
-                <w:sz w:val="18"/>
-                <w:szCs w:val="18"/>
-              </w:rPr>
-              <w:t>alasan</w:t>
-            </w:r>
-            <w:proofErr w:type="spellEnd"/>
-            <w:r>
-              <w:rPr>
-                <w:rFonts w:ascii="Book Antiqua" w:hAnsi="Book Antiqua"/>
-                <w:sz w:val="18"/>
-                <w:szCs w:val="18"/>
-              </w:rPr>
-              <w:t>}</w:t>
+              <w:t>${alasan}</w:t>
             </w:r>
           </w:p>
         </w:tc>
@@ -1510,7 +1291,6 @@
                 <w:szCs w:val="18"/>
               </w:rPr>
             </w:pPr>
-            <w:proofErr w:type="spellStart"/>
             <w:r>
               <w:rPr>
                 <w:rFonts w:ascii="Book Antiqua" w:hAnsi="Book Antiqua"/>
@@ -1519,7 +1299,6 @@
               </w:rPr>
               <w:t>Selama</w:t>
             </w:r>
-            <w:proofErr w:type="spellEnd"/>
           </w:p>
         </w:tc>
         <w:tc>
@@ -1548,25 +1327,7 @@
                 <w:sz w:val="18"/>
                 <w:szCs w:val="18"/>
               </w:rPr>
-              <w:t>${</w:t>
-            </w:r>
-            <w:proofErr w:type="spellStart"/>
-            <w:r>
-              <w:rPr>
-                <w:rFonts w:ascii="Book Antiqua" w:hAnsi="Book Antiqua"/>
-                <w:sz w:val="18"/>
-                <w:szCs w:val="18"/>
-              </w:rPr>
-              <w:t>lama_cuti_hari</w:t>
-            </w:r>
-            <w:proofErr w:type="spellEnd"/>
-            <w:r>
-              <w:rPr>
-                <w:rFonts w:ascii="Book Antiqua" w:hAnsi="Book Antiqua"/>
-                <w:sz w:val="18"/>
-                <w:szCs w:val="18"/>
-              </w:rPr>
-              <w:t>}</w:t>
+              <w:t>${lama_cuti_hari}</w:t>
             </w:r>
           </w:p>
         </w:tc>
@@ -1590,18 +1351,8 @@
                 <w:sz w:val="18"/>
                 <w:szCs w:val="18"/>
               </w:rPr>
-              <w:t xml:space="preserve">Mulai </w:t>
-            </w:r>
-            <w:proofErr w:type="spellStart"/>
-            <w:r>
-              <w:rPr>
-                <w:rFonts w:ascii="Book Antiqua" w:hAnsi="Book Antiqua"/>
-                <w:sz w:val="18"/>
-                <w:szCs w:val="18"/>
-              </w:rPr>
-              <w:t>tanggal</w:t>
-            </w:r>
-            <w:proofErr w:type="spellEnd"/>
+              <w:t>Mulai tanggal</w:t>
+            </w:r>
           </w:p>
         </w:tc>
         <w:tc>
@@ -1626,25 +1377,7 @@
                 <w:sz w:val="18"/>
                 <w:szCs w:val="18"/>
               </w:rPr>
-              <w:t>${</w:t>
-            </w:r>
-            <w:proofErr w:type="spellStart"/>
-            <w:r>
-              <w:rPr>
-                <w:rFonts w:ascii="Book Antiqua" w:hAnsi="Book Antiqua"/>
-                <w:sz w:val="18"/>
-                <w:szCs w:val="18"/>
-              </w:rPr>
-              <w:t>tgl_mulai</w:t>
-            </w:r>
-            <w:proofErr w:type="spellEnd"/>
-            <w:r>
-              <w:rPr>
-                <w:rFonts w:ascii="Book Antiqua" w:hAnsi="Book Antiqua"/>
-                <w:sz w:val="18"/>
-                <w:szCs w:val="18"/>
-              </w:rPr>
-              <w:t>}</w:t>
+              <w:t>${tgl_mulai}</w:t>
             </w:r>
           </w:p>
         </w:tc>
@@ -1694,25 +1427,7 @@
                 <w:sz w:val="18"/>
                 <w:szCs w:val="18"/>
               </w:rPr>
-              <w:t>${</w:t>
-            </w:r>
-            <w:proofErr w:type="spellStart"/>
-            <w:r>
-              <w:rPr>
-                <w:rFonts w:ascii="Book Antiqua" w:hAnsi="Book Antiqua"/>
-                <w:sz w:val="18"/>
-                <w:szCs w:val="18"/>
-              </w:rPr>
-              <w:t>tgl_selesai</w:t>
-            </w:r>
-            <w:proofErr w:type="spellEnd"/>
-            <w:r>
-              <w:rPr>
-                <w:rFonts w:ascii="Book Antiqua" w:hAnsi="Book Antiqua"/>
-                <w:sz w:val="18"/>
-                <w:szCs w:val="18"/>
-              </w:rPr>
-              <w:t>}</w:t>
+              <w:t>${tgl_selesai}</w:t>
             </w:r>
           </w:p>
         </w:tc>
@@ -1925,7 +1640,6 @@
                 <w:szCs w:val="18"/>
               </w:rPr>
             </w:pPr>
-            <w:proofErr w:type="spellStart"/>
             <w:r>
               <w:rPr>
                 <w:rFonts w:ascii="Book Antiqua" w:hAnsi="Book Antiqua"/>
@@ -1934,7 +1648,6 @@
               </w:rPr>
               <w:t>Tahun</w:t>
             </w:r>
-            <w:proofErr w:type="spellEnd"/>
           </w:p>
         </w:tc>
         <w:tc>
@@ -1981,7 +1694,6 @@
                 <w:szCs w:val="18"/>
               </w:rPr>
             </w:pPr>
-            <w:proofErr w:type="spellStart"/>
             <w:r>
               <w:rPr>
                 <w:rFonts w:ascii="Book Antiqua" w:hAnsi="Book Antiqua"/>
@@ -1990,7 +1702,6 @@
               </w:rPr>
               <w:t>Keterangan</w:t>
             </w:r>
-            <w:proofErr w:type="spellEnd"/>
           </w:p>
         </w:tc>
         <w:tc>
@@ -2452,41 +2163,45 @@
                 <w:sz w:val="16"/>
                 <w:szCs w:val="16"/>
               </w:rPr>
-              <w:t>${</w:t>
-            </w:r>
-            <w:proofErr w:type="spellStart"/>
+              <w:t>${thn_n}</w:t>
+            </w:r>
+          </w:p>
+        </w:tc>
+        <w:tc>
+          <w:tcPr>
+            <w:tcW w:w="918" w:type="dxa"/>
+            <w:vAlign w:val="center"/>
+          </w:tcPr>
+          <w:p>
+            <w:pPr>
+              <w:jc w:val="center"/>
+              <w:rPr>
+                <w:rFonts w:ascii="Book Antiqua" w:hAnsi="Book Antiqua"/>
+                <w:sz w:val="18"/>
+                <w:szCs w:val="18"/>
+              </w:rPr>
+            </w:pPr>
             <w:r>
               <w:rPr>
                 <w:rFonts w:ascii="Book Antiqua" w:hAnsi="Book Antiqua"/>
                 <w:sz w:val="16"/>
                 <w:szCs w:val="16"/>
               </w:rPr>
-              <w:t>thn_n</w:t>
-            </w:r>
-            <w:proofErr w:type="spellEnd"/>
-            <w:r>
+              <w:t>${sisa_n}</w:t>
+            </w:r>
+          </w:p>
+        </w:tc>
+        <w:tc>
+          <w:tcPr>
+            <w:tcW w:w="1726" w:type="dxa"/>
+          </w:tcPr>
+          <w:p>
+            <w:pPr>
               <w:rPr>
                 <w:rFonts w:ascii="Book Antiqua" w:hAnsi="Book Antiqua"/>
                 <w:sz w:val="16"/>
                 <w:szCs w:val="16"/>
               </w:rPr>
-              <w:t>}</w:t>
-            </w:r>
-          </w:p>
-        </w:tc>
-        <w:tc>
-          <w:tcPr>
-            <w:tcW w:w="918" w:type="dxa"/>
-            <w:vAlign w:val="center"/>
-          </w:tcPr>
-          <w:p>
-            <w:pPr>
-              <w:jc w:val="center"/>
-              <w:rPr>
-                <w:rFonts w:ascii="Book Antiqua" w:hAnsi="Book Antiqua"/>
-                <w:sz w:val="18"/>
-                <w:szCs w:val="18"/>
-              </w:rPr>
             </w:pPr>
             <w:r>
               <w:rPr>
@@ -2494,66 +2209,16 @@
                 <w:sz w:val="16"/>
                 <w:szCs w:val="16"/>
               </w:rPr>
-              <w:t>${</w:t>
-            </w:r>
-            <w:proofErr w:type="spellStart"/>
+              <w:t>${k</w:t>
+            </w:r>
             <w:r>
               <w:rPr>
                 <w:rFonts w:ascii="Book Antiqua" w:hAnsi="Book Antiqua"/>
                 <w:sz w:val="16"/>
                 <w:szCs w:val="16"/>
               </w:rPr>
-              <w:t>sisa_n</w:t>
-            </w:r>
-            <w:proofErr w:type="spellEnd"/>
-            <w:r>
-              <w:rPr>
-                <w:rFonts w:ascii="Book Antiqua" w:hAnsi="Book Antiqua"/>
-                <w:sz w:val="16"/>
-                <w:szCs w:val="16"/>
-              </w:rPr>
-              <w:t>}</w:t>
-            </w:r>
-          </w:p>
-        </w:tc>
-        <w:tc>
-          <w:tcPr>
-            <w:tcW w:w="1726" w:type="dxa"/>
-          </w:tcPr>
-          <w:p>
-            <w:pPr>
-              <w:rPr>
-                <w:rFonts w:ascii="Book Antiqua" w:hAnsi="Book Antiqua"/>
-                <w:sz w:val="16"/>
-                <w:szCs w:val="16"/>
-              </w:rPr>
-            </w:pPr>
-            <w:r>
-              <w:rPr>
-                <w:rFonts w:ascii="Book Antiqua" w:hAnsi="Book Antiqua"/>
-                <w:sz w:val="16"/>
-                <w:szCs w:val="16"/>
-              </w:rPr>
-              <w:t>${</w:t>
-            </w:r>
-            <w:proofErr w:type="spellStart"/>
-            <w:r>
-              <w:rPr>
-                <w:rFonts w:ascii="Book Antiqua" w:hAnsi="Book Antiqua"/>
-                <w:sz w:val="16"/>
-                <w:szCs w:val="16"/>
-              </w:rPr>
-              <w:t>k</w:t>
-            </w:r>
-            <w:r>
-              <w:rPr>
-                <w:rFonts w:ascii="Book Antiqua" w:hAnsi="Book Antiqua"/>
-                <w:sz w:val="16"/>
-                <w:szCs w:val="16"/>
-              </w:rPr>
               <w:t>et_th</w:t>
             </w:r>
-            <w:proofErr w:type="spellEnd"/>
             <w:r>
               <w:rPr>
                 <w:rFonts w:ascii="Book Antiqua" w:hAnsi="Book Antiqua"/>
@@ -2764,25 +2429,7 @@
                 <w:sz w:val="18"/>
                 <w:szCs w:val="18"/>
               </w:rPr>
-              <w:t>${</w:t>
-            </w:r>
-            <w:proofErr w:type="spellStart"/>
-            <w:r>
-              <w:rPr>
-                <w:rFonts w:ascii="Book Antiqua" w:hAnsi="Book Antiqua" w:cs="Arial"/>
-                <w:sz w:val="18"/>
-                <w:szCs w:val="18"/>
-              </w:rPr>
-              <w:t>telepon</w:t>
-            </w:r>
-            <w:proofErr w:type="spellEnd"/>
-            <w:r>
-              <w:rPr>
-                <w:rFonts w:ascii="Book Antiqua" w:hAnsi="Book Antiqua" w:cs="Arial"/>
-                <w:sz w:val="18"/>
-                <w:szCs w:val="18"/>
-              </w:rPr>
-              <w:t>}</w:t>
+              <w:t>${telepon}</w:t>
             </w:r>
           </w:p>
         </w:tc>
@@ -2825,25 +2472,7 @@
                 <w:sz w:val="18"/>
                 <w:szCs w:val="18"/>
               </w:rPr>
-              <w:t>${</w:t>
-            </w:r>
-            <w:proofErr w:type="spellStart"/>
-            <w:r>
-              <w:rPr>
-                <w:rFonts w:ascii="Book Antiqua" w:hAnsi="Book Antiqua"/>
-                <w:sz w:val="18"/>
-                <w:szCs w:val="18"/>
-              </w:rPr>
-              <w:t>alamat_cuti</w:t>
-            </w:r>
-            <w:proofErr w:type="spellEnd"/>
-            <w:r>
-              <w:rPr>
-                <w:rFonts w:ascii="Book Antiqua" w:hAnsi="Book Antiqua"/>
-                <w:sz w:val="18"/>
-                <w:szCs w:val="18"/>
-              </w:rPr>
-              <w:t>}</w:t>
+              <w:t>${alamat_cuti}</w:t>
             </w:r>
           </w:p>
         </w:tc>
@@ -2867,25 +2496,7 @@
                 <w:sz w:val="18"/>
                 <w:szCs w:val="18"/>
               </w:rPr>
-              <w:t xml:space="preserve">Hormat </w:t>
-            </w:r>
-            <w:proofErr w:type="spellStart"/>
-            <w:r>
-              <w:rPr>
-                <w:rFonts w:ascii="Book Antiqua" w:hAnsi="Book Antiqua"/>
-                <w:sz w:val="18"/>
-                <w:szCs w:val="18"/>
-              </w:rPr>
-              <w:t>saya</w:t>
-            </w:r>
-            <w:proofErr w:type="spellEnd"/>
-            <w:r>
-              <w:rPr>
-                <w:rFonts w:ascii="Book Antiqua" w:hAnsi="Book Antiqua"/>
-                <w:sz w:val="18"/>
-                <w:szCs w:val="18"/>
-              </w:rPr>
-              <w:t>,</w:t>
+              <w:t>Hormat saya,</w:t>
             </w:r>
           </w:p>
           <w:p>
@@ -2903,25 +2514,7 @@
                 <w:sz w:val="18"/>
                 <w:szCs w:val="18"/>
               </w:rPr>
-              <w:t>${</w:t>
-            </w:r>
-            <w:proofErr w:type="spellStart"/>
-            <w:r>
-              <w:rPr>
-                <w:rFonts w:ascii="Book Antiqua" w:hAnsi="Book Antiqua"/>
-                <w:sz w:val="18"/>
-                <w:szCs w:val="18"/>
-              </w:rPr>
-              <w:t>ttd_pengaju</w:t>
-            </w:r>
-            <w:proofErr w:type="spellEnd"/>
-            <w:r>
-              <w:rPr>
-                <w:rFonts w:ascii="Book Antiqua" w:hAnsi="Book Antiqua"/>
-                <w:sz w:val="18"/>
-                <w:szCs w:val="18"/>
-              </w:rPr>
-              <w:t>}</w:t>
+              <w:t>${ttd_pengaju}</w:t>
             </w:r>
           </w:p>
           <w:p>
@@ -3211,29 +2804,7 @@
                 <w:sz w:val="18"/>
                 <w:szCs w:val="18"/>
               </w:rPr>
-              <w:t>{</w:t>
-            </w:r>
-            <w:proofErr w:type="spellStart"/>
-            <w:r>
-              <w:rPr>
-                <w:rFonts w:ascii="Book Antiqua" w:hAnsi="Book Antiqua"/>
-                <w:b/>
-                <w:bCs/>
-                <w:sz w:val="18"/>
-                <w:szCs w:val="18"/>
-              </w:rPr>
-              <w:t>disetujui_atasan</w:t>
-            </w:r>
-            <w:proofErr w:type="spellEnd"/>
-            <w:r>
-              <w:rPr>
-                <w:rFonts w:ascii="Book Antiqua" w:hAnsi="Book Antiqua"/>
-                <w:b/>
-                <w:bCs/>
-                <w:sz w:val="18"/>
-                <w:szCs w:val="18"/>
-              </w:rPr>
-              <w:t>}</w:t>
+              <w:t>{disetujui_atasan}</w:t>
             </w:r>
           </w:p>
         </w:tc>
@@ -3314,39 +2885,7 @@
                 <w:sz w:val="18"/>
                 <w:szCs w:val="18"/>
               </w:rPr>
-              <w:t>{</w:t>
-            </w:r>
-            <w:proofErr w:type="spellStart"/>
-            <w:r>
-              <w:rPr>
-                <w:rFonts w:ascii="Book Antiqua" w:hAnsi="Book Antiqua"/>
-                <w:b/>
-                <w:bCs/>
-                <w:sz w:val="18"/>
-                <w:szCs w:val="18"/>
-              </w:rPr>
-              <w:t>tidak_</w:t>
-            </w:r>
-            <w:r>
-              <w:rPr>
-                <w:rFonts w:ascii="Book Antiqua" w:hAnsi="Book Antiqua"/>
-                <w:b/>
-                <w:bCs/>
-                <w:sz w:val="18"/>
-                <w:szCs w:val="18"/>
-              </w:rPr>
-              <w:t>disetujui_atasan</w:t>
-            </w:r>
-            <w:proofErr w:type="spellEnd"/>
-            <w:r>
-              <w:rPr>
-                <w:rFonts w:ascii="Book Antiqua" w:hAnsi="Book Antiqua"/>
-                <w:b/>
-                <w:bCs/>
-                <w:sz w:val="18"/>
-                <w:szCs w:val="18"/>
-              </w:rPr>
-              <w:t>}</w:t>
+              <w:t>{tidak_disetujui_atasan}</w:t>
             </w:r>
           </w:p>
         </w:tc>
@@ -3446,25 +2985,7 @@
                 <w:sz w:val="18"/>
                 <w:szCs w:val="18"/>
               </w:rPr>
-              <w:t>${</w:t>
-            </w:r>
-            <w:proofErr w:type="spellStart"/>
-            <w:r>
-              <w:rPr>
-                <w:rFonts w:ascii="Book Antiqua" w:hAnsi="Book Antiqua"/>
-                <w:sz w:val="18"/>
-                <w:szCs w:val="18"/>
-              </w:rPr>
-              <w:t>jab_atasan</w:t>
-            </w:r>
-            <w:proofErr w:type="spellEnd"/>
-            <w:r>
-              <w:rPr>
-                <w:rFonts w:ascii="Book Antiqua" w:hAnsi="Book Antiqua"/>
-                <w:sz w:val="18"/>
-                <w:szCs w:val="18"/>
-              </w:rPr>
-              <w:t>}</w:t>
+              <w:t>${jab_atasan}</w:t>
             </w:r>
             <w:r>
               <w:rPr>
@@ -3492,25 +3013,7 @@
                 <w:sz w:val="18"/>
                 <w:szCs w:val="18"/>
               </w:rPr>
-              <w:t>${</w:t>
-            </w:r>
-            <w:proofErr w:type="spellStart"/>
-            <w:r>
-              <w:rPr>
-                <w:rFonts w:ascii="Book Antiqua" w:hAnsi="Book Antiqua"/>
-                <w:sz w:val="18"/>
-                <w:szCs w:val="18"/>
-              </w:rPr>
-              <w:t>ttd_atasan</w:t>
-            </w:r>
-            <w:proofErr w:type="spellEnd"/>
-            <w:r>
-              <w:rPr>
-                <w:rFonts w:ascii="Book Antiqua" w:hAnsi="Book Antiqua"/>
-                <w:sz w:val="18"/>
-                <w:szCs w:val="18"/>
-              </w:rPr>
-              <w:t>}</w:t>
+              <w:t>${ttd_atasan}</w:t>
             </w:r>
           </w:p>
           <w:p>
@@ -3536,43 +3039,23 @@
                 <w:szCs w:val="18"/>
                 <w:u w:val="single"/>
               </w:rPr>
-              <w:t>${</w:t>
-            </w:r>
-            <w:proofErr w:type="spellStart"/>
+              <w:t>${nama_atasan}</w:t>
+            </w:r>
+          </w:p>
+          <w:p>
+            <w:pPr>
+              <w:jc w:val="center"/>
+              <w:rPr>
+                <w:rFonts w:ascii="Book Antiqua" w:eastAsia="Times New Roman" w:hAnsi="Book Antiqua" w:cs="Arial"/>
+                <w:sz w:val="18"/>
+                <w:szCs w:val="18"/>
+              </w:rPr>
+            </w:pPr>
             <w:r>
               <w:rPr>
                 <w:rFonts w:ascii="Book Antiqua" w:hAnsi="Book Antiqua" w:cs="Arial"/>
                 <w:sz w:val="18"/>
                 <w:szCs w:val="18"/>
-                <w:u w:val="single"/>
-              </w:rPr>
-              <w:t>nama_atasan</w:t>
-            </w:r>
-            <w:proofErr w:type="spellEnd"/>
-            <w:r>
-              <w:rPr>
-                <w:rFonts w:ascii="Book Antiqua" w:hAnsi="Book Antiqua" w:cs="Arial"/>
-                <w:sz w:val="18"/>
-                <w:szCs w:val="18"/>
-                <w:u w:val="single"/>
-              </w:rPr>
-              <w:t>}</w:t>
-            </w:r>
-          </w:p>
-          <w:p>
-            <w:pPr>
-              <w:jc w:val="center"/>
-              <w:rPr>
-                <w:rFonts w:ascii="Book Antiqua" w:eastAsia="Times New Roman" w:hAnsi="Book Antiqua" w:cs="Arial"/>
-                <w:sz w:val="18"/>
-                <w:szCs w:val="18"/>
-              </w:rPr>
-            </w:pPr>
-            <w:r>
-              <w:rPr>
-                <w:rFonts w:ascii="Book Antiqua" w:hAnsi="Book Antiqua" w:cs="Arial"/>
-                <w:sz w:val="18"/>
-                <w:szCs w:val="18"/>
               </w:rPr>
               <w:t xml:space="preserve">NIP. </w:t>
             </w:r>
@@ -3583,27 +3066,7 @@
                 <w:sz w:val="18"/>
                 <w:szCs w:val="18"/>
               </w:rPr>
-              <w:t>${</w:t>
-            </w:r>
-            <w:proofErr w:type="spellStart"/>
-            <w:r>
-              <w:rPr>
-                <w:rFonts w:ascii="Book Antiqua" w:hAnsi="Book Antiqua"/>
-                <w:color w:val="000000" w:themeColor="text1"/>
-                <w:sz w:val="18"/>
-                <w:szCs w:val="18"/>
-              </w:rPr>
-              <w:t>nip_atasan</w:t>
-            </w:r>
-            <w:proofErr w:type="spellEnd"/>
-            <w:r>
-              <w:rPr>
-                <w:rFonts w:ascii="Book Antiqua" w:hAnsi="Book Antiqua"/>
-                <w:color w:val="000000" w:themeColor="text1"/>
-                <w:sz w:val="18"/>
-                <w:szCs w:val="18"/>
-              </w:rPr>
-              <w:t>}</w:t>
+              <w:t>${nip_atasan}</w:t>
             </w:r>
           </w:p>
         </w:tc>
@@ -3813,39 +3276,7 @@
                 <w:sz w:val="18"/>
                 <w:szCs w:val="18"/>
               </w:rPr>
-              <w:t>{</w:t>
-            </w:r>
-            <w:proofErr w:type="spellStart"/>
-            <w:r>
-              <w:rPr>
-                <w:rFonts w:ascii="Book Antiqua" w:hAnsi="Book Antiqua"/>
-                <w:b/>
-                <w:bCs/>
-                <w:sz w:val="18"/>
-                <w:szCs w:val="18"/>
-              </w:rPr>
-              <w:t>disetujui_</w:t>
-            </w:r>
-            <w:r>
-              <w:rPr>
-                <w:rFonts w:ascii="Book Antiqua" w:hAnsi="Book Antiqua"/>
-                <w:b/>
-                <w:bCs/>
-                <w:sz w:val="18"/>
-                <w:szCs w:val="18"/>
-              </w:rPr>
-              <w:t>pejabat</w:t>
-            </w:r>
-            <w:proofErr w:type="spellEnd"/>
-            <w:r>
-              <w:rPr>
-                <w:rFonts w:ascii="Book Antiqua" w:hAnsi="Book Antiqua"/>
-                <w:b/>
-                <w:bCs/>
-                <w:sz w:val="18"/>
-                <w:szCs w:val="18"/>
-              </w:rPr>
-              <w:t>}</w:t>
+              <w:t>{disetujui_pejabat}</w:t>
             </w:r>
           </w:p>
         </w:tc>
@@ -3930,39 +3361,7 @@
                 <w:sz w:val="18"/>
                 <w:szCs w:val="18"/>
               </w:rPr>
-              <w:t>{</w:t>
-            </w:r>
-            <w:proofErr w:type="spellStart"/>
-            <w:r>
-              <w:rPr>
-                <w:rFonts w:ascii="Book Antiqua" w:hAnsi="Book Antiqua"/>
-                <w:b/>
-                <w:bCs/>
-                <w:sz w:val="18"/>
-                <w:szCs w:val="18"/>
-              </w:rPr>
-              <w:t>tidak_</w:t>
-            </w:r>
-            <w:r>
-              <w:rPr>
-                <w:rFonts w:ascii="Book Antiqua" w:hAnsi="Book Antiqua"/>
-                <w:b/>
-                <w:bCs/>
-                <w:sz w:val="18"/>
-                <w:szCs w:val="18"/>
-              </w:rPr>
-              <w:t>disetujui_pejabat</w:t>
-            </w:r>
-            <w:proofErr w:type="spellEnd"/>
-            <w:r>
-              <w:rPr>
-                <w:rFonts w:ascii="Book Antiqua" w:hAnsi="Book Antiqua"/>
-                <w:b/>
-                <w:bCs/>
-                <w:sz w:val="18"/>
-                <w:szCs w:val="18"/>
-              </w:rPr>
-              <w:t>}</w:t>
+              <w:t>{tidak_disetujui_pejabat}</w:t>
             </w:r>
           </w:p>
         </w:tc>
@@ -4062,25 +3461,7 @@
                 <w:sz w:val="18"/>
                 <w:szCs w:val="18"/>
               </w:rPr>
-              <w:t>${</w:t>
-            </w:r>
-            <w:proofErr w:type="spellStart"/>
-            <w:r>
-              <w:rPr>
-                <w:rFonts w:ascii="Book Antiqua" w:hAnsi="Book Antiqua"/>
-                <w:sz w:val="18"/>
-                <w:szCs w:val="18"/>
-              </w:rPr>
-              <w:t>jab_pejabat</w:t>
-            </w:r>
-            <w:proofErr w:type="spellEnd"/>
-            <w:r>
-              <w:rPr>
-                <w:rFonts w:ascii="Book Antiqua" w:hAnsi="Book Antiqua"/>
-                <w:sz w:val="18"/>
-                <w:szCs w:val="18"/>
-              </w:rPr>
-              <w:t>}</w:t>
+              <w:t>${jab_pejabat}</w:t>
             </w:r>
             <w:r>
               <w:rPr>
@@ -4108,25 +3489,7 @@
                 <w:sz w:val="18"/>
                 <w:szCs w:val="18"/>
               </w:rPr>
-              <w:t>${</w:t>
-            </w:r>
-            <w:proofErr w:type="spellStart"/>
-            <w:r>
-              <w:rPr>
-                <w:rFonts w:ascii="Book Antiqua" w:hAnsi="Book Antiqua"/>
-                <w:sz w:val="18"/>
-                <w:szCs w:val="18"/>
-              </w:rPr>
-              <w:t>ttd_pejabat</w:t>
-            </w:r>
-            <w:proofErr w:type="spellEnd"/>
-            <w:r>
-              <w:rPr>
-                <w:rFonts w:ascii="Book Antiqua" w:hAnsi="Book Antiqua"/>
-                <w:sz w:val="18"/>
-                <w:szCs w:val="18"/>
-              </w:rPr>
-              <w:t>}</w:t>
+              <w:t>${ttd_pejabat}</w:t>
             </w:r>
           </w:p>
           <w:p>
@@ -4152,27 +3515,7 @@
                 <w:szCs w:val="18"/>
                 <w:u w:val="single"/>
               </w:rPr>
-              <w:t>${</w:t>
-            </w:r>
-            <w:proofErr w:type="spellStart"/>
-            <w:r>
-              <w:rPr>
-                <w:rFonts w:ascii="Book Antiqua" w:hAnsi="Book Antiqua" w:cs="Arial"/>
-                <w:sz w:val="18"/>
-                <w:szCs w:val="18"/>
-                <w:u w:val="single"/>
-              </w:rPr>
-              <w:t>nama_pejabat</w:t>
-            </w:r>
-            <w:proofErr w:type="spellEnd"/>
-            <w:r>
-              <w:rPr>
-                <w:rFonts w:ascii="Book Antiqua" w:hAnsi="Book Antiqua" w:cs="Arial"/>
-                <w:sz w:val="18"/>
-                <w:szCs w:val="18"/>
-                <w:u w:val="single"/>
-              </w:rPr>
-              <w:t>}</w:t>
+              <w:t>${nama_pejabat}</w:t>
             </w:r>
           </w:p>
           <w:p>
@@ -4205,27 +3548,7 @@
                 <w:sz w:val="18"/>
                 <w:szCs w:val="18"/>
               </w:rPr>
-              <w:t>${</w:t>
-            </w:r>
-            <w:proofErr w:type="spellStart"/>
-            <w:r>
-              <w:rPr>
-                <w:rFonts w:ascii="Book Antiqua" w:hAnsi="Book Antiqua"/>
-                <w:color w:val="000000" w:themeColor="text1"/>
-                <w:sz w:val="18"/>
-                <w:szCs w:val="18"/>
-              </w:rPr>
-              <w:t>nip_pejabat</w:t>
-            </w:r>
-            <w:proofErr w:type="spellEnd"/>
-            <w:r>
-              <w:rPr>
-                <w:rFonts w:ascii="Book Antiqua" w:hAnsi="Book Antiqua"/>
-                <w:color w:val="000000" w:themeColor="text1"/>
-                <w:sz w:val="18"/>
-                <w:szCs w:val="18"/>
-              </w:rPr>
-              <w:t>}</w:t>
+              <w:t>${nip_pejabat}</w:t>
             </w:r>
           </w:p>
         </w:tc>
@@ -4512,72 +3835,8 @@
               <w:sz w:val="16"/>
               <w:szCs w:val="16"/>
             </w:rPr>
-            <w:t xml:space="preserve">Jalan Bung </w:t>
+            <w:t>Jalan Bung Tomo No. 136 Kec. Samarinda Seberang, Kota Samarinda</w:t>
           </w:r>
-          <w:proofErr w:type="spellStart"/>
-          <w:r>
-            <w:rPr>
-              <w:rFonts w:ascii="Book Antiqua" w:hAnsi="Book Antiqua" w:cs="Times New Roman"/>
-              <w:sz w:val="16"/>
-              <w:szCs w:val="16"/>
-            </w:rPr>
-            <w:t>Tomo</w:t>
-          </w:r>
-          <w:proofErr w:type="spellEnd"/>
-          <w:r>
-            <w:rPr>
-              <w:rFonts w:ascii="Book Antiqua" w:hAnsi="Book Antiqua" w:cs="Times New Roman"/>
-              <w:sz w:val="16"/>
-              <w:szCs w:val="16"/>
-            </w:rPr>
-            <w:t xml:space="preserve"> No. 136 </w:t>
-          </w:r>
-          <w:proofErr w:type="spellStart"/>
-          <w:r>
-            <w:rPr>
-              <w:rFonts w:ascii="Book Antiqua" w:hAnsi="Book Antiqua" w:cs="Times New Roman"/>
-              <w:sz w:val="16"/>
-              <w:szCs w:val="16"/>
-            </w:rPr>
-            <w:t>Kec</w:t>
-          </w:r>
-          <w:proofErr w:type="spellEnd"/>
-          <w:r>
-            <w:rPr>
-              <w:rFonts w:ascii="Book Antiqua" w:hAnsi="Book Antiqua" w:cs="Times New Roman"/>
-              <w:sz w:val="16"/>
-              <w:szCs w:val="16"/>
-            </w:rPr>
-            <w:t xml:space="preserve">. </w:t>
-          </w:r>
-          <w:proofErr w:type="spellStart"/>
-          <w:r>
-            <w:rPr>
-              <w:rFonts w:ascii="Book Antiqua" w:hAnsi="Book Antiqua" w:cs="Times New Roman"/>
-              <w:sz w:val="16"/>
-              <w:szCs w:val="16"/>
-            </w:rPr>
-            <w:t>Samarinda</w:t>
-          </w:r>
-          <w:proofErr w:type="spellEnd"/>
-          <w:r>
-            <w:rPr>
-              <w:rFonts w:ascii="Book Antiqua" w:hAnsi="Book Antiqua" w:cs="Times New Roman"/>
-              <w:sz w:val="16"/>
-              <w:szCs w:val="16"/>
-            </w:rPr>
-            <w:t xml:space="preserve"> Seberang, Kota </w:t>
-          </w:r>
-          <w:proofErr w:type="spellStart"/>
-          <w:r>
-            <w:rPr>
-              <w:rFonts w:ascii="Book Antiqua" w:hAnsi="Book Antiqua" w:cs="Times New Roman"/>
-              <w:sz w:val="16"/>
-              <w:szCs w:val="16"/>
-            </w:rPr>
-            <w:t>Samarinda</w:t>
-          </w:r>
-          <w:proofErr w:type="spellEnd"/>
         </w:p>
         <w:p>
           <w:pPr>
@@ -4592,23 +3851,13 @@
               <w:lang w:val="id-ID"/>
             </w:rPr>
           </w:pPr>
-          <w:proofErr w:type="spellStart"/>
           <w:r>
             <w:rPr>
               <w:rFonts w:ascii="Book Antiqua" w:hAnsi="Book Antiqua" w:cs="Times New Roman"/>
               <w:sz w:val="16"/>
               <w:szCs w:val="16"/>
             </w:rPr>
-            <w:t>Provinsi</w:t>
-          </w:r>
-          <w:proofErr w:type="spellEnd"/>
-          <w:r>
-            <w:rPr>
-              <w:rFonts w:ascii="Book Antiqua" w:hAnsi="Book Antiqua" w:cs="Times New Roman"/>
-              <w:sz w:val="16"/>
-              <w:szCs w:val="16"/>
-            </w:rPr>
-            <w:t xml:space="preserve"> Kalimantan Timur, www.ptun-samarinda.go.id</w:t>
+            <w:t>Provinsi Kalimantan Timur, www.ptun-samarinda.go.id</w:t>
           </w:r>
         </w:p>
         <w:p>

</xml_diff>